<commit_message>
Trim the Oracle Fusion alternatives from the standard cost checklist
The ERP is confirmed as Oracle EBS, so the Fusion cost-scenario text was
dead weight.

Co-Authored-By: Claude Fable 5.1 <noreply@anthropic.com>
Claude-Session: https://claude.ai/code/session_01HYPr12gJ7yT998qrKuSZbE
</commit_message>
<xml_diff>
--- a/dist/docs/templates/domain/standard-cost-update-checklist.docx
+++ b/dist/docs/templates/domain/standard-cost-update-checklist.docx
@@ -215,8 +215,8 @@
         <w:tblLayout w:type="fixed"/>
       </w:tblPr>
       <w:tblGrid>
-        <w:gridCol w:w="2984"/>
-        <w:gridCol w:w="6375"/>
+        <w:gridCol w:w="3016"/>
+        <w:gridCol w:w="6343"/>
       </w:tblGrid>
       <w:tr>
         <w:trPr>
@@ -224,7 +224,7 @@
         </w:trPr>
         <w:tc>
           <w:tcPr>
-            <w:tcW w:w="2984" w:type="dxa"/>
+            <w:tcW w:w="3016" w:type="dxa"/>
           </w:tcPr>
           <w:p>
             <w:pPr>
@@ -238,7 +238,7 @@
         </w:tc>
         <w:tc>
           <w:tcPr>
-            <w:tcW w:w="6375" w:type="dxa"/>
+            <w:tcW w:w="6343" w:type="dxa"/>
           </w:tcPr>
           <w:p>
             <w:pPr>
@@ -254,7 +254,7 @@
       <w:tr>
         <w:tc>
           <w:tcPr>
-            <w:tcW w:w="2984" w:type="dxa"/>
+            <w:tcW w:w="3016" w:type="dxa"/>
           </w:tcPr>
           <w:p>
             <w:pPr>
@@ -268,7 +268,7 @@
         </w:tc>
         <w:tc>
           <w:tcPr>
-            <w:tcW w:w="6375" w:type="dxa"/>
+            <w:tcW w:w="6343" w:type="dxa"/>
           </w:tcPr>
           <w:p>
             <w:pPr>
@@ -284,7 +284,7 @@
       <w:tr>
         <w:tc>
           <w:tcPr>
-            <w:tcW w:w="2984" w:type="dxa"/>
+            <w:tcW w:w="3016" w:type="dxa"/>
           </w:tcPr>
           <w:p>
             <w:pPr>
@@ -298,7 +298,7 @@
         </w:tc>
         <w:tc>
           <w:tcPr>
-            <w:tcW w:w="6375" w:type="dxa"/>
+            <w:tcW w:w="6343" w:type="dxa"/>
           </w:tcPr>
           <w:p>
             <w:pPr>
@@ -314,7 +314,7 @@
       <w:tr>
         <w:tc>
           <w:tcPr>
-            <w:tcW w:w="2984" w:type="dxa"/>
+            <w:tcW w:w="3016" w:type="dxa"/>
           </w:tcPr>
           <w:p>
             <w:pPr>
@@ -328,23 +328,23 @@
         </w:tc>
         <w:tc>
           <w:tcPr>
-            <w:tcW w:w="6375" w:type="dxa"/>
-          </w:tcPr>
-          <w:p>
-            <w:pPr>
-              <w:pStyle w:val="Compact"/>
-              <w:jc w:val="left"/>
-            </w:pPr>
-            <w:r>
-              <w:t xml:space="preserve">[COMPANY: EBS pending cost type name, or Fusion cost scenario naming rule]</w:t>
-            </w:r>
-          </w:p>
-        </w:tc>
-      </w:tr>
-      <w:tr>
-        <w:tc>
-          <w:tcPr>
-            <w:tcW w:w="2984" w:type="dxa"/>
+            <w:tcW w:w="6343" w:type="dxa"/>
+          </w:tcPr>
+          <w:p>
+            <w:pPr>
+              <w:pStyle w:val="Compact"/>
+              <w:jc w:val="left"/>
+            </w:pPr>
+            <w:r>
+              <w:t xml:space="preserve">[COMPANY: EBS pending cost type name]</w:t>
+            </w:r>
+          </w:p>
+        </w:tc>
+      </w:tr>
+      <w:tr>
+        <w:tc>
+          <w:tcPr>
+            <w:tcW w:w="3016" w:type="dxa"/>
           </w:tcPr>
           <w:p>
             <w:pPr>
@@ -358,7 +358,7 @@
         </w:tc>
         <w:tc>
           <w:tcPr>
-            <w:tcW w:w="6375" w:type="dxa"/>
+            <w:tcW w:w="6343" w:type="dxa"/>
           </w:tcPr>
           <w:p>
             <w:pPr>
@@ -374,7 +374,7 @@
       <w:tr>
         <w:tc>
           <w:tcPr>
-            <w:tcW w:w="2984" w:type="dxa"/>
+            <w:tcW w:w="3016" w:type="dxa"/>
           </w:tcPr>
           <w:p>
             <w:pPr>
@@ -388,23 +388,23 @@
         </w:tc>
         <w:tc>
           <w:tcPr>
-            <w:tcW w:w="6375" w:type="dxa"/>
-          </w:tcPr>
-          <w:p>
-            <w:pPr>
-              <w:pStyle w:val="Compact"/>
-              <w:jc w:val="left"/>
-            </w:pPr>
-            <w:r>
-              <w:t xml:space="preserve">[COMPANY: per unit amount, or % of material value (EBS basis type Item, Lot or Total Value; Fusion equivalent)]. If duty is held as a % of material value, record how the rate is converted from the customs value: Oracle applies it to the material cost, not to the duty base</w:t>
-            </w:r>
-          </w:p>
-        </w:tc>
-      </w:tr>
-      <w:tr>
-        <w:tc>
-          <w:tcPr>
-            <w:tcW w:w="2984" w:type="dxa"/>
+            <w:tcW w:w="6343" w:type="dxa"/>
+          </w:tcPr>
+          <w:p>
+            <w:pPr>
+              <w:pStyle w:val="Compact"/>
+              <w:jc w:val="left"/>
+            </w:pPr>
+            <w:r>
+              <w:t xml:space="preserve">[COMPANY: per unit amount, or % of material value (EBS basis type Item, Lot or Total Value)]. If duty is held as a % of material value, record how the rate is converted from the customs value: Oracle applies it to the material cost, not to the duty base</w:t>
+            </w:r>
+          </w:p>
+        </w:tc>
+      </w:tr>
+      <w:tr>
+        <w:tc>
+          <w:tcPr>
+            <w:tcW w:w="3016" w:type="dxa"/>
           </w:tcPr>
           <w:p>
             <w:pPr>
@@ -418,7 +418,7 @@
         </w:tc>
         <w:tc>
           <w:tcPr>
-            <w:tcW w:w="6375" w:type="dxa"/>
+            <w:tcW w:w="6343" w:type="dxa"/>
           </w:tcPr>
           <w:p>
             <w:pPr>
@@ -434,7 +434,7 @@
       <w:tr>
         <w:tc>
           <w:tcPr>
-            <w:tcW w:w="2984" w:type="dxa"/>
+            <w:tcW w:w="3016" w:type="dxa"/>
           </w:tcPr>
           <w:p>
             <w:pPr>
@@ -448,7 +448,7 @@
         </w:tc>
         <w:tc>
           <w:tcPr>
-            <w:tcW w:w="6375" w:type="dxa"/>
+            <w:tcW w:w="6343" w:type="dxa"/>
           </w:tcPr>
           <w:p>
             <w:pPr>
@@ -464,7 +464,7 @@
       <w:tr>
         <w:tc>
           <w:tcPr>
-            <w:tcW w:w="2984" w:type="dxa"/>
+            <w:tcW w:w="3016" w:type="dxa"/>
           </w:tcPr>
           <w:p>
             <w:pPr>
@@ -478,7 +478,7 @@
         </w:tc>
         <w:tc>
           <w:tcPr>
-            <w:tcW w:w="6375" w:type="dxa"/>
+            <w:tcW w:w="6343" w:type="dxa"/>
           </w:tcPr>
           <w:p>
             <w:pPr>
@@ -494,7 +494,7 @@
       <w:tr>
         <w:tc>
           <w:tcPr>
-            <w:tcW w:w="2984" w:type="dxa"/>
+            <w:tcW w:w="3016" w:type="dxa"/>
           </w:tcPr>
           <w:p>
             <w:pPr>
@@ -508,7 +508,7 @@
         </w:tc>
         <w:tc>
           <w:tcPr>
-            <w:tcW w:w="6375" w:type="dxa"/>
+            <w:tcW w:w="6343" w:type="dxa"/>
           </w:tcPr>
           <w:p>
             <w:pPr>
@@ -524,7 +524,7 @@
       <w:tr>
         <w:tc>
           <w:tcPr>
-            <w:tcW w:w="2984" w:type="dxa"/>
+            <w:tcW w:w="3016" w:type="dxa"/>
           </w:tcPr>
           <w:p>
             <w:pPr>
@@ -538,7 +538,7 @@
         </w:tc>
         <w:tc>
           <w:tcPr>
-            <w:tcW w:w="6375" w:type="dxa"/>
+            <w:tcW w:w="6343" w:type="dxa"/>
           </w:tcPr>
           <w:p>
             <w:pPr>
@@ -566,7 +566,7 @@
       <w:tr>
         <w:tc>
           <w:tcPr>
-            <w:tcW w:w="2984" w:type="dxa"/>
+            <w:tcW w:w="3016" w:type="dxa"/>
           </w:tcPr>
           <w:p>
             <w:pPr>
@@ -580,7 +580,7 @@
         </w:tc>
         <w:tc>
           <w:tcPr>
-            <w:tcW w:w="6375" w:type="dxa"/>
+            <w:tcW w:w="6343" w:type="dxa"/>
           </w:tcPr>
           <w:p>
             <w:pPr>
@@ -596,7 +596,7 @@
       <w:tr>
         <w:tc>
           <w:tcPr>
-            <w:tcW w:w="2984" w:type="dxa"/>
+            <w:tcW w:w="3016" w:type="dxa"/>
           </w:tcPr>
           <w:p>
             <w:pPr>
@@ -610,7 +610,7 @@
         </w:tc>
         <w:tc>
           <w:tcPr>
-            <w:tcW w:w="6375" w:type="dxa"/>
+            <w:tcW w:w="6343" w:type="dxa"/>
           </w:tcPr>
           <w:p>
             <w:pPr>
@@ -626,7 +626,7 @@
       <w:tr>
         <w:tc>
           <w:tcPr>
-            <w:tcW w:w="2984" w:type="dxa"/>
+            <w:tcW w:w="3016" w:type="dxa"/>
           </w:tcPr>
           <w:p>
             <w:pPr>
@@ -640,7 +640,7 @@
         </w:tc>
         <w:tc>
           <w:tcPr>
-            <w:tcW w:w="6375" w:type="dxa"/>
+            <w:tcW w:w="6343" w:type="dxa"/>
           </w:tcPr>
           <w:p>
             <w:pPr>
@@ -656,7 +656,7 @@
       <w:tr>
         <w:tc>
           <w:tcPr>
-            <w:tcW w:w="2984" w:type="dxa"/>
+            <w:tcW w:w="3016" w:type="dxa"/>
           </w:tcPr>
           <w:p>
             <w:pPr>
@@ -670,7 +670,7 @@
         </w:tc>
         <w:tc>
           <w:tcPr>
-            <w:tcW w:w="6375" w:type="dxa"/>
+            <w:tcW w:w="6343" w:type="dxa"/>
           </w:tcPr>
           <w:p>
             <w:pPr>
@@ -2738,7 +2738,7 @@
         <w:pStyle w:val="Compact"/>
       </w:pPr>
       <w:r>
-        <w:t xml:space="preserve">☐ Book time: checker review (Manager, about 1.5 h between T-10 and T-7), Finance approval (T-6 to T-5), load window. In EBS, Oracle recommends running the update at the start of the accounting period, before transactions start for the new period. In Fusion, the cost scenario's effective date controls when new costs apply.</w:t>
+        <w:t xml:space="preserve">☐ Book time: checker review (Manager, about 1.5 h between T-10 and T-7), Finance approval (T-6 to T-5), load window. Oracle recommends running the update at the start of the accounting period, before transactions start for the new period.</w:t>
       </w:r>
     </w:p>
     <w:p>
@@ -3273,7 +3273,7 @@
         <w:pStyle w:val="Compact"/>
       </w:pPr>
       <w:r>
-        <w:t xml:space="preserve">☐ The pending cost type (EBS) or cost scenario (Fusion) holds the complete new cost for every item in scope: every cost element and sub-element, not only the changed duty or landed-cost sub-elements. In EBS the update replaces the item's whole Frozen cost with its pending cost, so a duty-only file would wipe the other elements: copy the current Frozen costs into the pending cost type first ([COMPANY: copy method]), then apply the changes. Confirm with Finance how items with no pending cost are treated (the cost type's default cost type).</w:t>
+        <w:t xml:space="preserve">☐ The pending cost type holds the complete new cost for every item in scope: every cost element and sub-element, not only the changed duty or landed-cost sub-elements. The update replaces the item's whole Frozen cost with its pending cost, so a duty-only file would wipe the other elements: copy the current Frozen costs into the pending cost type first ([COMPANY: copy method]), then apply the changes. Confirm with Finance how items with no pending cost are treated (the cost type's default cost type).</w:t>
       </w:r>
     </w:p>
     <w:p>
@@ -3285,7 +3285,7 @@
         <w:pStyle w:val="Compact"/>
       </w:pPr>
       <w:r>
-        <w:t xml:space="preserve">☐ Load the approved file into [COMPANY: pending cost type (EBS) or cost scenario (Fusion)], never straight into the live standard.</w:t>
+        <w:t xml:space="preserve">☐ Load the approved file into [COMPANY: pending cost type], never straight into the live standard.</w:t>
       </w:r>
     </w:p>
     <w:p>
@@ -3309,7 +3309,7 @@
         <w:pStyle w:val="Compact"/>
       </w:pPr>
       <w:r>
-        <w:t xml:space="preserve">☐ Simulate before updating. EBS: run Report Pending Adjustments, which produces the inventory, intransit and WIP standard cost adjustment reports without posting. Fusion: compare the scenario's standard costs with the current published costs (and the inventory impact view, where your release has it).</w:t>
+        <w:t xml:space="preserve">☐ Simulate before updating: run Report Pending Adjustments, which produces the inventory, intransit and WIP standard cost adjustment reports without posting.</w:t>
       </w:r>
     </w:p>
     <w:p>
@@ -3333,7 +3333,7 @@
         <w:pStyle w:val="Compact"/>
       </w:pPr>
       <w:r>
-        <w:t xml:space="preserve">☐ Run the update at the agreed time. EBS: Update Standard Costs from the pending cost type to Frozen. Fusion: run the update or publish step for the cost scenario with the agreed effective date. Done by [COMPANY: who runs the update], with Finance informed.</w:t>
+        <w:t xml:space="preserve">☐ Run the update at the agreed time: Update Standard Costs from the pending cost type to Frozen. Done by [COMPANY: who runs the update], with Finance informed.</w:t>
       </w:r>
     </w:p>
     <w:p>
@@ -3357,7 +3357,7 @@
         <w:pStyle w:val="Compact"/>
       </w:pPr>
       <w:r>
-        <w:t xml:space="preserve">☐ Know the correction path before you start: in Fusion a published scenario cannot be unpublished once its costs are used in transactions (an Undo Cost Update task exists for unintended updates); in EBS a correction normally means another cost update. Agree the path with Finance in advance.</w:t>
+        <w:t xml:space="preserve">☐ Know the correction path before you start: a correction normally means another cost update. Agree the path with Finance in advance.</w:t>
       </w:r>
     </w:p>
     <w:bookmarkEnd w:id="30"/>

</xml_diff>